<commit_message>
feat(word): rebuild inheritance document export
</commit_message>
<xml_diff>
--- a/word_templates/1. PCDS .docx
+++ b/word_templates/1. PCDS .docx
@@ -158,7 +158,7 @@
         </w:rPr>
       </w:pPr>
       <w:r>
-        <w:t xml:space="preserve">Hôm nay, tại Trung tâm phục vụ hành chính công xã [Niêm Yết], tỉnh Ninh Bình. Hàng thừa kế của [Cụm ngườ để lại di sản] gồm những người có tên sau đây: </w:t>
+        <w:t>Hôm nay, tại Trung tâm phục vụ hành chính công xã [Niêm Yết], tỉnh Ninh Bình. Hàng thừa kế của [Chủ đất chết 1 - Xưng hô] [Chủ đất chết 1 - Họ tên][Nối chủ đất chết 2][Chủ đất chết 2 - Xưng hô] [Chủ đất chết 2 - Họ tên] gồm những người có tên sau đây:</w:t>
       </w:r>
     </w:p>
     <w:p>
@@ -174,10 +174,7 @@
         </w:rPr>
       </w:pPr>
       <w:r>
-        <w:rPr>
-          <w:sz w:val="26"/>
-        </w:rPr>
-        <w:t>[Danh sách ngườ nhận và chưa chọn]</w:t>
+        <w:t>[Dòng người 1]</w:t>
       </w:r>
     </w:p>
     <w:p>
@@ -188,6 +185,9 @@
           <w:lang w:val="pt-BR"/>
         </w:rPr>
       </w:pPr>
+      <w:r>
+        <w:t>[Dòng người 2]</w:t>
+      </w:r>
     </w:p>
     <w:p>
       <w:pPr>
@@ -197,6 +197,9 @@
           <w:lang w:val="pt-BR"/>
         </w:rPr>
       </w:pPr>
+      <w:r>
+        <w:t>[Dòng người 3]</w:t>
+      </w:r>
     </w:p>
     <w:p>
       <w:pPr>
@@ -206,6 +209,9 @@
           <w:lang w:val="pt-BR"/>
         </w:rPr>
       </w:pPr>
+      <w:r>
+        <w:t>[Dòng người 4]</w:t>
+      </w:r>
     </w:p>
     <w:p>
       <w:pPr>
@@ -219,6 +225,9 @@
           <w:lang w:val="pt-BR"/>
         </w:rPr>
       </w:pPr>
+      <w:r>
+        <w:t>[Dòng người 5]</w:t>
+      </w:r>
     </w:p>
     <w:p>
       <w:pPr>
@@ -228,6 +237,9 @@
           <w:lang w:val="pt-BR"/>
         </w:rPr>
       </w:pPr>
+      <w:r>
+        <w:t>[Dòng người 6]</w:t>
+      </w:r>
     </w:p>
     <w:p>
       <w:pPr>
@@ -237,6 +249,9 @@
           <w:lang w:val="pt-BR"/>
         </w:rPr>
       </w:pPr>
+      <w:r>
+        <w:t>[Dòng người 7]</w:t>
+      </w:r>
     </w:p>
     <w:p>
       <w:pPr>
@@ -246,6 +261,9 @@
           <w:lang w:val="pt-BR"/>
         </w:rPr>
       </w:pPr>
+      <w:r>
+        <w:t>[Dòng người 8]</w:t>
+      </w:r>
     </w:p>
     <w:p>
       <w:pPr>
@@ -259,6 +277,9 @@
           <w:lang w:val="pt-BR"/>
         </w:rPr>
       </w:pPr>
+      <w:r>
+        <w:t>[Dòng người 9]</w:t>
+      </w:r>
     </w:p>
     <w:p>
       <w:pPr>
@@ -268,6 +289,9 @@
           <w:lang w:val="pt-BR"/>
         </w:rPr>
       </w:pPr>
+      <w:r>
+        <w:t>[Dòng người 10]</w:t>
+      </w:r>
     </w:p>
     <w:p>
       <w:pPr>
@@ -277,6 +301,9 @@
           <w:lang w:val="pt-BR"/>
         </w:rPr>
       </w:pPr>
+      <w:r>
+        <w:t>[Dòng người 11]</w:t>
+      </w:r>
     </w:p>
     <w:p>
       <w:pPr>
@@ -286,6 +313,9 @@
           <w:lang w:val="pt-BR"/>
         </w:rPr>
       </w:pPr>
+      <w:r>
+        <w:t>[Dòng người 12]</w:t>
+      </w:r>
     </w:p>
     <w:p>
       <w:pPr>
@@ -299,6 +329,9 @@
           <w:lang w:val="pt-BR"/>
         </w:rPr>
       </w:pPr>
+      <w:r>
+        <w:t>[Dòng người 13]</w:t>
+      </w:r>
     </w:p>
     <w:p>
       <w:pPr>
@@ -308,6 +341,9 @@
           <w:lang w:val="pt-BR"/>
         </w:rPr>
       </w:pPr>
+      <w:r>
+        <w:t>[Dòng người 14]</w:t>
+      </w:r>
     </w:p>
     <w:p>
       <w:pPr>
@@ -317,6 +353,9 @@
           <w:lang w:val="pt-BR"/>
         </w:rPr>
       </w:pPr>
+      <w:r>
+        <w:t>[Dòng người 15]</w:t>
+      </w:r>
     </w:p>
     <w:p>
       <w:pPr>
@@ -326,6 +365,9 @@
           <w:lang w:val="pt-BR"/>
         </w:rPr>
       </w:pPr>
+      <w:r>
+        <w:t>[Dòng người 16]</w:t>
+      </w:r>
     </w:p>
     <w:p>
       <w:pPr>
@@ -339,6 +381,9 @@
           <w:lang w:val="pt-BR"/>
         </w:rPr>
       </w:pPr>
+      <w:r>
+        <w:t>[Dòng người 17]</w:t>
+      </w:r>
     </w:p>
     <w:p>
       <w:pPr>
@@ -348,6 +393,9 @@
           <w:lang w:val="pt-BR"/>
         </w:rPr>
       </w:pPr>
+      <w:r>
+        <w:t>[Dòng người 18]</w:t>
+      </w:r>
     </w:p>
     <w:p>
       <w:pPr>
@@ -357,6 +405,9 @@
           <w:lang w:val="pt-BR"/>
         </w:rPr>
       </w:pPr>
+      <w:r>
+        <w:t>[Dòng người 19]</w:t>
+      </w:r>
     </w:p>
     <w:p>
       <w:pPr>
@@ -366,6 +417,9 @@
           <w:lang w:val="pt-BR"/>
         </w:rPr>
       </w:pPr>
+      <w:r>
+        <w:t>[Dòng người 20]</w:t>
+      </w:r>
     </w:p>
     <w:p>
       <w:pPr>
@@ -379,6 +433,7 @@
           <w:lang w:val="pt-BR"/>
         </w:rPr>
       </w:pPr>
+      <w:r/>
     </w:p>
     <w:p>
       <w:pPr>
@@ -388,6 +443,7 @@
           <w:lang w:val="pt-BR"/>
         </w:rPr>
       </w:pPr>
+      <w:r/>
     </w:p>
     <w:p>
       <w:pPr>
@@ -397,6 +453,7 @@
           <w:lang w:val="pt-BR"/>
         </w:rPr>
       </w:pPr>
+      <w:r/>
     </w:p>
     <w:p>
       <w:pPr>
@@ -407,6 +464,7 @@
           <w:bCs/>
         </w:rPr>
       </w:pPr>
+      <w:r/>
     </w:p>
     <w:p>
       <w:pPr>
@@ -420,6 +478,7 @@
           <w:lang w:val="pt-BR"/>
         </w:rPr>
       </w:pPr>
+      <w:r/>
     </w:p>
     <w:p>
       <w:pPr>
@@ -429,6 +488,7 @@
           <w:lang w:val="pt-BR"/>
         </w:rPr>
       </w:pPr>
+      <w:r/>
     </w:p>
     <w:p>
       <w:pPr>
@@ -438,6 +498,7 @@
           <w:lang w:val="pt-BR"/>
         </w:rPr>
       </w:pPr>
+      <w:r/>
     </w:p>
     <w:p>
       <w:pPr>
@@ -447,6 +508,7 @@
           <w:lang w:val="pt-BR"/>
         </w:rPr>
       </w:pPr>
+      <w:r/>
     </w:p>
     <w:p>
       <w:pPr>
@@ -460,6 +522,7 @@
           <w:lang w:val="pt-BR"/>
         </w:rPr>
       </w:pPr>
+      <w:r/>
     </w:p>
     <w:p>
       <w:pPr>
@@ -469,6 +532,7 @@
           <w:lang w:val="pt-BR"/>
         </w:rPr>
       </w:pPr>
+      <w:r/>
     </w:p>
     <w:p>
       <w:pPr>
@@ -478,6 +542,7 @@
           <w:lang w:val="pt-BR"/>
         </w:rPr>
       </w:pPr>
+      <w:r/>
     </w:p>
     <w:p>
       <w:pPr>
@@ -487,6 +552,7 @@
           <w:lang w:val="pt-BR"/>
         </w:rPr>
       </w:pPr>
+      <w:r/>
     </w:p>
     <w:p>
       <w:pPr>
@@ -500,6 +566,7 @@
           <w:lang w:val="pt-BR"/>
         </w:rPr>
       </w:pPr>
+      <w:r/>
     </w:p>
     <w:p>
       <w:pPr>
@@ -509,6 +576,7 @@
           <w:lang w:val="pt-BR"/>
         </w:rPr>
       </w:pPr>
+      <w:r/>
     </w:p>
     <w:p>
       <w:pPr>
@@ -518,6 +586,7 @@
           <w:lang w:val="pt-BR"/>
         </w:rPr>
       </w:pPr>
+      <w:r/>
     </w:p>
     <w:p>
       <w:pPr>
@@ -527,6 +596,7 @@
           <w:lang w:val="pt-BR"/>
         </w:rPr>
       </w:pPr>
+      <w:r/>
     </w:p>
     <w:p>
       <w:pPr>
@@ -540,6 +610,7 @@
           <w:lang w:val="pt-BR"/>
         </w:rPr>
       </w:pPr>
+      <w:r/>
     </w:p>
     <w:p>
       <w:pPr>
@@ -549,6 +620,7 @@
           <w:lang w:val="pt-BR"/>
         </w:rPr>
       </w:pPr>
+      <w:r/>
     </w:p>
     <w:p>
       <w:pPr>
@@ -558,6 +630,7 @@
           <w:lang w:val="pt-BR"/>
         </w:rPr>
       </w:pPr>
+      <w:r/>
     </w:p>
     <w:p>
       <w:pPr>
@@ -567,6 +640,7 @@
           <w:lang w:val="pt-BR"/>
         </w:rPr>
       </w:pPr>
+      <w:r/>
     </w:p>
     <w:bookmarkEnd w:id="0"/>
     <w:p>
@@ -580,10 +654,7 @@
         </w:rPr>
       </w:pPr>
       <w:r>
-        <w:rPr>
-          <w:sz w:val="26"/>
-        </w:rPr>
-        <w:t>[Đoạn ngườ chết là chủ đất]</w:t>
+        <w:t>[Dòng khai tử chủ đất chết 1]</w:t>
       </w:r>
     </w:p>
     <w:p>
@@ -596,6 +667,9 @@
           <w:bCs/>
         </w:rPr>
       </w:pPr>
+      <w:r>
+        <w:t>[Dòng khai tử chủ đất chết 2]</w:t>
+      </w:r>
     </w:p>
     <w:p>
       <w:pPr>
@@ -604,9 +678,6 @@
         <w:jc w:val="both"/>
       </w:pPr>
       <w:r>
-        <w:rPr>
-          <w:sz w:val="26"/>
-        </w:rPr>
         <w:t>[Đoạn quan hệ gia đình]</w:t>
       </w:r>
     </w:p>
@@ -616,6 +687,9 @@
         <w:ind w:right="39" w:firstLine="567"/>
         <w:jc w:val="both"/>
       </w:pPr>
+      <w:r>
+        <w:t>[Dòng người từ chối 1]</w:t>
+      </w:r>
     </w:p>
     <w:p>
       <w:pPr>
@@ -623,6 +697,9 @@
         <w:ind w:right="39" w:firstLine="567"/>
         <w:jc w:val="both"/>
       </w:pPr>
+      <w:r>
+        <w:t>[Dòng người từ chối 2]</w:t>
+      </w:r>
     </w:p>
     <w:p>
       <w:pPr>
@@ -630,6 +707,9 @@
         <w:ind w:right="39" w:firstLine="567"/>
         <w:jc w:val="both"/>
       </w:pPr>
+      <w:r>
+        <w:t>[Dòng người từ chối 3]</w:t>
+      </w:r>
     </w:p>
     <w:p>
       <w:pPr>
@@ -643,6 +723,9 @@
           <w:lang w:val="pt-BR"/>
         </w:rPr>
       </w:pPr>
+      <w:r>
+        <w:t>[Dòng người từ chối 4]</w:t>
+      </w:r>
     </w:p>
     <w:p>
       <w:pPr>
@@ -656,6 +739,9 @@
           <w:lang w:val="pt-BR"/>
         </w:rPr>
       </w:pPr>
+      <w:r>
+        <w:t>[Dòng người từ chối 5]</w:t>
+      </w:r>
     </w:p>
     <w:p>
       <w:pPr>
@@ -669,6 +755,9 @@
           <w:lang w:val="pt-BR"/>
         </w:rPr>
       </w:pPr>
+      <w:r>
+        <w:t>[Dòng người từ chối 6]</w:t>
+      </w:r>
     </w:p>
     <w:p>
       <w:pPr>
@@ -682,6 +771,9 @@
           <w:lang w:val="pt-BR"/>
         </w:rPr>
       </w:pPr>
+      <w:r>
+        <w:t>[Dòng người từ chối 7]</w:t>
+      </w:r>
     </w:p>
     <w:p>
       <w:pPr>
@@ -695,6 +787,9 @@
           <w:lang w:val="pt-BR"/>
         </w:rPr>
       </w:pPr>
+      <w:r>
+        <w:t>[Dòng người từ chối 8]</w:t>
+      </w:r>
     </w:p>
     <w:p>
       <w:pPr>
@@ -709,6 +804,9 @@
           <w:bCs/>
         </w:rPr>
       </w:pPr>
+      <w:r>
+        <w:t>[Dòng người từ chối 9]</w:t>
+      </w:r>
     </w:p>
     <w:p>
       <w:pPr>
@@ -722,6 +820,9 @@
           <w:lang w:val="pt-BR"/>
         </w:rPr>
       </w:pPr>
+      <w:r>
+        <w:t>[Dòng người từ chối 10]</w:t>
+      </w:r>
     </w:p>
     <w:p>
       <w:pPr>
@@ -735,6 +836,9 @@
           <w:lang w:val="pt-BR"/>
         </w:rPr>
       </w:pPr>
+      <w:r>
+        <w:t>[Dòng người từ chối 11]</w:t>
+      </w:r>
     </w:p>
     <w:p>
       <w:pPr>
@@ -748,6 +852,9 @@
           <w:lang w:val="pt-BR"/>
         </w:rPr>
       </w:pPr>
+      <w:r>
+        <w:t>[Dòng người từ chối 12]</w:t>
+      </w:r>
     </w:p>
     <w:p>
       <w:pPr>
@@ -758,6 +865,9 @@
         <w:spacing w:before="60" w:line="330" w:lineRule="exact"/>
         <w:ind w:left="567" w:hanging="283"/>
       </w:pPr>
+      <w:r>
+        <w:t>[Dòng người từ chối 13]</w:t>
+      </w:r>
     </w:p>
     <w:p>
       <w:pPr>
@@ -768,6 +878,9 @@
           <w:lang w:val="pt-BR"/>
         </w:rPr>
       </w:pPr>
+      <w:r>
+        <w:t>[Dòng người từ chối 14]</w:t>
+      </w:r>
     </w:p>
     <w:p>
       <w:pPr>
@@ -778,12 +891,7 @@
           <w:lang w:val="pt-BR"/>
         </w:rPr>
       </w:pPr>
-      <w:r>
-        <w:rPr>
-          <w:sz w:val="26"/>
-        </w:rPr>
-        <w:t>[Đoạn mô tả di sản]</w:t>
-      </w:r>
+      <w:r/>
     </w:p>
     <w:p>
       <w:pPr>
@@ -794,6 +902,9 @@
           <w:lang w:val="pt-BR"/>
         </w:rPr>
       </w:pPr>
+      <w:r>
+        <w:t>[Dòng người từ chối 16]</w:t>
+      </w:r>
     </w:p>
     <w:p>
       <w:pPr>
@@ -806,6 +917,9 @@
           <w:lang w:val="vi-VN"/>
         </w:rPr>
       </w:pPr>
+      <w:r>
+        <w:t>[Dòng người từ chối 17]</w:t>
+      </w:r>
     </w:p>
     <w:p>
       <w:pPr>
@@ -821,6 +935,9 @@
           <w:lang w:val="nl-NL"/>
         </w:rPr>
       </w:pPr>
+      <w:r>
+        <w:t>[Dòng người từ chối 18]</w:t>
+      </w:r>
     </w:p>
     <w:p>
       <w:pPr>
@@ -835,6 +952,9 @@
           <w:color w:val="494949"/>
         </w:rPr>
       </w:pPr>
+      <w:r>
+        <w:t>[Dòng người từ chối 19]</w:t>
+      </w:r>
     </w:p>
     <w:p>
       <w:pPr>
@@ -850,6 +970,9 @@
           <w:lang w:val="nl-NL"/>
         </w:rPr>
       </w:pPr>
+      <w:r>
+        <w:t>[Dòng người từ chối 20]</w:t>
+      </w:r>
     </w:p>
     <w:p>
       <w:pPr>
@@ -861,6 +984,9 @@
         <w:ind w:left="709" w:hanging="357"/>
         <w:jc w:val="both"/>
       </w:pPr>
+      <w:r>
+        <w:t>[Đoạn mô tả di sản]</w:t>
+      </w:r>
     </w:p>
     <w:p>
       <w:pPr>
@@ -876,6 +1002,7 @@
           <w:lang w:val="nl-NL"/>
         </w:rPr>
       </w:pPr>
+      <w:r/>
     </w:p>
     <w:p>
       <w:pPr>
@@ -891,6 +1018,7 @@
           <w:lang w:val="nl-NL"/>
         </w:rPr>
       </w:pPr>
+      <w:r/>
     </w:p>
     <w:p>
       <w:pPr>
@@ -902,9 +1030,6 @@
         </w:rPr>
       </w:pPr>
       <w:r>
-        <w:rPr>
-          <w:sz w:val="26"/>
-        </w:rPr>
         <w:t>[Đoạn phân chia di sản]</w:t>
       </w:r>
     </w:p>
@@ -975,7 +1100,7 @@
         <w:jc w:val="both"/>
       </w:pPr>
       <w:r>
-        <w:t>- Ngoài chúng tôi ra, [Cụm ngườ để lại di sản] không còn người thừa kế nào khác, nếu sau này phát sinh thừa kế chúng tôi hoàn toàn chịu trách nhiệm trước pháp luật, kể cả việc thanh toán bồi hoàn cho họ.</w:t>
+        <w:t>Ngoài chúng tôi ra, [Chủ đất chết 1 - Xưng hô] [Chủ đất chết 1 - Họ tên][Nối chủ đất chết 2][Chủ đất chết 2 - Xưng hô] [Chủ đất chết 2 - Họ tên] không còn người thừa kế nào khác, nếu sau này phát sinh thừa kế chúng tôi hoàn toàn chịu trách nhiệm trước pháp luật, kể cả việc thanh toán bồi hoàn cho họ.</w:t>
       </w:r>
     </w:p>
     <w:p>
@@ -1090,11 +1215,8 @@
             <w:vAlign w:val="center"/>
           </w:tcPr>
           <w:p>
-            <w:pPr>
-              <w:spacing w:before="60" w:line="330" w:lineRule="exact"/>
-            </w:pPr>
-            <w:r>
-              <w:t>[Họ tên ngườ ký 1]</w:t>
+            <w:r>
+              <w:t>[Họ tên người ký 1]</w:t>
             </w:r>
           </w:p>
         </w:tc>
@@ -1120,11 +1242,8 @@
             <w:vAlign w:val="center"/>
           </w:tcPr>
           <w:p>
-            <w:pPr>
-              <w:spacing w:before="60" w:line="330" w:lineRule="exact"/>
-            </w:pPr>
-            <w:r>
-              <w:t>[Họ tên ngườ ký 2]</w:t>
+            <w:r>
+              <w:t>[Họ tên người ký 2]</w:t>
             </w:r>
           </w:p>
         </w:tc>
@@ -1150,11 +1269,8 @@
             <w:vAlign w:val="center"/>
           </w:tcPr>
           <w:p>
-            <w:pPr>
-              <w:spacing w:before="60" w:line="330" w:lineRule="exact"/>
-            </w:pPr>
-            <w:r>
-              <w:t>[Họ tên ngườ ký 3]</w:t>
+            <w:r>
+              <w:t>[Họ tên người ký 3]</w:t>
             </w:r>
           </w:p>
         </w:tc>
@@ -1180,11 +1296,8 @@
             <w:vAlign w:val="center"/>
           </w:tcPr>
           <w:p>
-            <w:pPr>
-              <w:spacing w:before="60" w:line="330" w:lineRule="exact"/>
-            </w:pPr>
-            <w:r>
-              <w:t>[Họ tên ngườ ký 4]</w:t>
+            <w:r>
+              <w:t>[Họ tên người ký 4]</w:t>
             </w:r>
           </w:p>
         </w:tc>
@@ -1210,11 +1323,8 @@
             <w:vAlign w:val="center"/>
           </w:tcPr>
           <w:p>
-            <w:pPr>
-              <w:spacing w:before="60" w:line="330" w:lineRule="exact"/>
-            </w:pPr>
-            <w:r>
-              <w:t>[Họ tên ngườ ký 5]</w:t>
+            <w:r>
+              <w:t>[Họ tên người ký 5]</w:t>
             </w:r>
           </w:p>
         </w:tc>
@@ -1240,11 +1350,8 @@
             <w:vAlign w:val="center"/>
           </w:tcPr>
           <w:p>
-            <w:pPr>
-              <w:spacing w:before="60" w:line="330" w:lineRule="exact"/>
-            </w:pPr>
-            <w:r>
-              <w:t>[Họ tên ngườ ký 6]</w:t>
+            <w:r>
+              <w:t>[Họ tên người ký 6]</w:t>
             </w:r>
           </w:p>
         </w:tc>
@@ -1270,11 +1377,8 @@
             <w:vAlign w:val="center"/>
           </w:tcPr>
           <w:p>
-            <w:pPr>
-              <w:spacing w:before="60" w:line="330" w:lineRule="exact"/>
-            </w:pPr>
-            <w:r>
-              <w:t>[Họ tên ngườ ký 7]</w:t>
+            <w:r>
+              <w:t>[Họ tên người ký 7]</w:t>
             </w:r>
           </w:p>
         </w:tc>
@@ -1300,11 +1404,8 @@
             <w:vAlign w:val="center"/>
           </w:tcPr>
           <w:p>
-            <w:pPr>
-              <w:spacing w:before="60" w:line="330" w:lineRule="exact"/>
-            </w:pPr>
-            <w:r>
-              <w:t>[Họ tên ngườ ký 8]</w:t>
+            <w:r>
+              <w:t>[Họ tên người ký 8]</w:t>
             </w:r>
           </w:p>
         </w:tc>
@@ -1330,23 +1431,20 @@
             <w:vAlign w:val="center"/>
           </w:tcPr>
           <w:p>
+            <w:r>
+              <w:t>[Họ tên người ký 9]</w:t>
+            </w:r>
+          </w:p>
+        </w:tc>
+        <w:tc>
+          <w:tcPr>
+            <w:tcW w:w="4761" w:type="dxa"/>
+            <w:vAlign w:val="center"/>
+          </w:tcPr>
+          <w:p>
             <w:pPr>
               <w:spacing w:before="60" w:line="330" w:lineRule="exact"/>
             </w:pPr>
-            <w:r>
-              <w:t>[Họ tên ngườ ký 9]</w:t>
-            </w:r>
-          </w:p>
-        </w:tc>
-        <w:tc>
-          <w:tcPr>
-            <w:tcW w:w="4761" w:type="dxa"/>
-            <w:vAlign w:val="center"/>
-          </w:tcPr>
-          <w:p>
-            <w:pPr>
-              <w:spacing w:before="60" w:line="330" w:lineRule="exact"/>
-            </w:pPr>
           </w:p>
         </w:tc>
       </w:tr>
@@ -1357,7 +1455,7 @@
           </w:tcPr>
           <w:p>
             <w:r>
-              <w:t>[Họ tên ngườ ký 10]</w:t>
+              <w:t>[Họ tên người ký 10]</w:t>
             </w:r>
           </w:p>
         </w:tc>
@@ -1377,7 +1475,7 @@
           </w:tcPr>
           <w:p>
             <w:r>
-              <w:t>[Họ tên ngườ ký 11]</w:t>
+              <w:t>[Họ tên người ký 11]</w:t>
             </w:r>
           </w:p>
         </w:tc>
@@ -1397,7 +1495,7 @@
           </w:tcPr>
           <w:p>
             <w:r>
-              <w:t>[Họ tên ngườ ký 12]</w:t>
+              <w:t>[Họ tên người ký 12]</w:t>
             </w:r>
           </w:p>
         </w:tc>
@@ -1417,7 +1515,7 @@
           </w:tcPr>
           <w:p>
             <w:r>
-              <w:t>[Họ tên ngườ ký 13]</w:t>
+              <w:t>[Họ tên người ký 13]</w:t>
             </w:r>
           </w:p>
         </w:tc>
@@ -1437,7 +1535,7 @@
           </w:tcPr>
           <w:p>
             <w:r>
-              <w:t>[Họ tên ngườ ký 14]</w:t>
+              <w:t>[Họ tên người ký 14]</w:t>
             </w:r>
           </w:p>
         </w:tc>
@@ -1457,7 +1555,7 @@
           </w:tcPr>
           <w:p>
             <w:r>
-              <w:t>[Họ tên ngườ ký 15]</w:t>
+              <w:t>[Họ tên người ký 15]</w:t>
             </w:r>
           </w:p>
         </w:tc>
@@ -1477,7 +1575,7 @@
           </w:tcPr>
           <w:p>
             <w:r>
-              <w:t>[Họ tên ngườ ký 16]</w:t>
+              <w:t>[Họ tên người ký 16]</w:t>
             </w:r>
           </w:p>
         </w:tc>
@@ -1497,7 +1595,7 @@
           </w:tcPr>
           <w:p>
             <w:r>
-              <w:t>[Họ tên ngườ ký 17]</w:t>
+              <w:t>[Họ tên người ký 17]</w:t>
             </w:r>
           </w:p>
         </w:tc>
@@ -1517,7 +1615,7 @@
           </w:tcPr>
           <w:p>
             <w:r>
-              <w:t>[Họ tên ngườ ký 18]</w:t>
+              <w:t>[Họ tên người ký 18]</w:t>
             </w:r>
           </w:p>
         </w:tc>
@@ -1537,7 +1635,7 @@
           </w:tcPr>
           <w:p>
             <w:r>
-              <w:t>[Họ tên ngườ ký 19]</w:t>
+              <w:t>[Họ tên người ký 19]</w:t>
             </w:r>
           </w:p>
         </w:tc>
@@ -1557,7 +1655,7 @@
           </w:tcPr>
           <w:p>
             <w:r>
-              <w:t>[Họ tên ngườ ký 20]</w:t>
+              <w:t>[Họ tên người ký 20]</w:t>
             </w:r>
           </w:p>
         </w:tc>
@@ -1766,10 +1864,7 @@
         <w:jc w:val="both"/>
       </w:pPr>
       <w:r>
-        <w:rPr>
-          <w:sz w:val="26"/>
-        </w:rPr>
-        <w:t>[Danh sách ngườ ký]</w:t>
+        <w:t>[Danh sách người ký]</w:t>
       </w:r>
     </w:p>
     <w:p>
@@ -2364,7 +2459,7 @@
           </w:tcPr>
           <w:p>
             <w:r>
-              <w:t>[Họ tên hàng thừa kế 1]</w:t>
+              <w:t>[Hàng thừa kế 1 - Họ tên]</w:t>
             </w:r>
           </w:p>
         </w:tc>
@@ -2374,7 +2469,7 @@
           </w:tcPr>
           <w:p>
             <w:r>
-              <w:t>[Năm sinh hàng thừa kế 1]</w:t>
+              <w:t>[Hàng thừa kế 1 - Năm sinh]</w:t>
             </w:r>
           </w:p>
         </w:tc>
@@ -2384,7 +2479,7 @@
           </w:tcPr>
           <w:p>
             <w:r>
-              <w:t>[Địa chỉ hàng thừa kế 1]</w:t>
+              <w:t>[Hàng thừa kế 1 - Địa chỉ]</w:t>
             </w:r>
           </w:p>
         </w:tc>
@@ -2394,7 +2489,7 @@
           </w:tcPr>
           <w:p>
             <w:r>
-              <w:t>[Ghi chú hàng thừa kế 1]</w:t>
+              <w:t>[Hàng thừa kế 1 - Ghi chú]</w:t>
             </w:r>
           </w:p>
         </w:tc>
@@ -2416,7 +2511,7 @@
           </w:tcPr>
           <w:p>
             <w:r>
-              <w:t>[Họ tên hàng thừa kế 2]</w:t>
+              <w:t>[Hàng thừa kế 2 - Họ tên]</w:t>
             </w:r>
           </w:p>
         </w:tc>
@@ -2426,7 +2521,7 @@
           </w:tcPr>
           <w:p>
             <w:r>
-              <w:t>[Năm sinh hàng thừa kế 2]</w:t>
+              <w:t>[Hàng thừa kế 2 - Năm sinh]</w:t>
             </w:r>
           </w:p>
         </w:tc>
@@ -2436,7 +2531,7 @@
           </w:tcPr>
           <w:p>
             <w:r>
-              <w:t>[Địa chỉ hàng thừa kế 2]</w:t>
+              <w:t>[Hàng thừa kế 2 - Địa chỉ]</w:t>
             </w:r>
           </w:p>
         </w:tc>
@@ -2446,7 +2541,7 @@
           </w:tcPr>
           <w:p>
             <w:r>
-              <w:t>[Ghi chú hàng thừa kế 2]</w:t>
+              <w:t>[Hàng thừa kế 2 - Ghi chú]</w:t>
             </w:r>
           </w:p>
         </w:tc>
@@ -2468,7 +2563,7 @@
           </w:tcPr>
           <w:p>
             <w:r>
-              <w:t>[Họ tên hàng thừa kế 3]</w:t>
+              <w:t>[Hàng thừa kế 3 - Họ tên]</w:t>
             </w:r>
           </w:p>
         </w:tc>
@@ -2478,7 +2573,7 @@
           </w:tcPr>
           <w:p>
             <w:r>
-              <w:t>[Năm sinh hàng thừa kế 3]</w:t>
+              <w:t>[Hàng thừa kế 3 - Năm sinh]</w:t>
             </w:r>
           </w:p>
         </w:tc>
@@ -2488,7 +2583,7 @@
           </w:tcPr>
           <w:p>
             <w:r>
-              <w:t>[Địa chỉ hàng thừa kế 3]</w:t>
+              <w:t>[Hàng thừa kế 3 - Địa chỉ]</w:t>
             </w:r>
           </w:p>
         </w:tc>
@@ -2498,7 +2593,7 @@
           </w:tcPr>
           <w:p>
             <w:r>
-              <w:t>[Ghi chú hàng thừa kế 3]</w:t>
+              <w:t>[Hàng thừa kế 3 - Ghi chú]</w:t>
             </w:r>
           </w:p>
         </w:tc>
@@ -2520,7 +2615,7 @@
           </w:tcPr>
           <w:p>
             <w:r>
-              <w:t>[Họ tên hàng thừa kế 4]</w:t>
+              <w:t>[Hàng thừa kế 4 - Họ tên]</w:t>
             </w:r>
           </w:p>
         </w:tc>
@@ -2530,7 +2625,7 @@
           </w:tcPr>
           <w:p>
             <w:r>
-              <w:t>[Năm sinh hàng thừa kế 4]</w:t>
+              <w:t>[Hàng thừa kế 4 - Năm sinh]</w:t>
             </w:r>
           </w:p>
         </w:tc>
@@ -2540,7 +2635,7 @@
           </w:tcPr>
           <w:p>
             <w:r>
-              <w:t>[Địa chỉ hàng thừa kế 4]</w:t>
+              <w:t>[Hàng thừa kế 4 - Địa chỉ]</w:t>
             </w:r>
           </w:p>
         </w:tc>
@@ -2550,7 +2645,7 @@
           </w:tcPr>
           <w:p>
             <w:r>
-              <w:t>[Ghi chú hàng thừa kế 4]</w:t>
+              <w:t>[Hàng thừa kế 4 - Ghi chú]</w:t>
             </w:r>
           </w:p>
         </w:tc>
@@ -2572,7 +2667,7 @@
           </w:tcPr>
           <w:p>
             <w:r>
-              <w:t>[Họ tên hàng thừa kế 5]</w:t>
+              <w:t>[Hàng thừa kế 5 - Họ tên]</w:t>
             </w:r>
           </w:p>
         </w:tc>
@@ -2582,7 +2677,7 @@
           </w:tcPr>
           <w:p>
             <w:r>
-              <w:t>[Năm sinh hàng thừa kế 5]</w:t>
+              <w:t>[Hàng thừa kế 5 - Năm sinh]</w:t>
             </w:r>
           </w:p>
         </w:tc>
@@ -2592,7 +2687,7 @@
           </w:tcPr>
           <w:p>
             <w:r>
-              <w:t>[Địa chỉ hàng thừa kế 5]</w:t>
+              <w:t>[Hàng thừa kế 5 - Địa chỉ]</w:t>
             </w:r>
           </w:p>
         </w:tc>
@@ -2602,7 +2697,7 @@
           </w:tcPr>
           <w:p>
             <w:r>
-              <w:t>[Ghi chú hàng thừa kế 5]</w:t>
+              <w:t>[Hàng thừa kế 5 - Ghi chú]</w:t>
             </w:r>
           </w:p>
         </w:tc>
@@ -2624,7 +2719,7 @@
           </w:tcPr>
           <w:p>
             <w:r>
-              <w:t>[Họ tên hàng thừa kế 6]</w:t>
+              <w:t>[Hàng thừa kế 6 - Họ tên]</w:t>
             </w:r>
           </w:p>
         </w:tc>
@@ -2634,7 +2729,7 @@
           </w:tcPr>
           <w:p>
             <w:r>
-              <w:t>[Năm sinh hàng thừa kế 6]</w:t>
+              <w:t>[Hàng thừa kế 6 - Năm sinh]</w:t>
             </w:r>
           </w:p>
         </w:tc>
@@ -2644,7 +2739,7 @@
           </w:tcPr>
           <w:p>
             <w:r>
-              <w:t>[Địa chỉ hàng thừa kế 6]</w:t>
+              <w:t>[Hàng thừa kế 6 - Địa chỉ]</w:t>
             </w:r>
           </w:p>
         </w:tc>
@@ -2654,7 +2749,7 @@
           </w:tcPr>
           <w:p>
             <w:r>
-              <w:t>[Ghi chú hàng thừa kế 6]</w:t>
+              <w:t>[Hàng thừa kế 6 - Ghi chú]</w:t>
             </w:r>
           </w:p>
         </w:tc>
@@ -2676,7 +2771,7 @@
           </w:tcPr>
           <w:p>
             <w:r>
-              <w:t>[Họ tên hàng thừa kế 7]</w:t>
+              <w:t>[Hàng thừa kế 7 - Họ tên]</w:t>
             </w:r>
           </w:p>
         </w:tc>
@@ -2686,7 +2781,7 @@
           </w:tcPr>
           <w:p>
             <w:r>
-              <w:t>[Năm sinh hàng thừa kế 7]</w:t>
+              <w:t>[Hàng thừa kế 7 - Năm sinh]</w:t>
             </w:r>
           </w:p>
         </w:tc>
@@ -2696,7 +2791,7 @@
           </w:tcPr>
           <w:p>
             <w:r>
-              <w:t>[Địa chỉ hàng thừa kế 7]</w:t>
+              <w:t>[Hàng thừa kế 7 - Địa chỉ]</w:t>
             </w:r>
           </w:p>
         </w:tc>
@@ -2706,7 +2801,7 @@
           </w:tcPr>
           <w:p>
             <w:r>
-              <w:t>[Ghi chú hàng thừa kế 7]</w:t>
+              <w:t>[Hàng thừa kế 7 - Ghi chú]</w:t>
             </w:r>
           </w:p>
         </w:tc>
@@ -2728,7 +2823,7 @@
           </w:tcPr>
           <w:p>
             <w:r>
-              <w:t>[Họ tên hàng thừa kế 8]</w:t>
+              <w:t>[Hàng thừa kế 8 - Họ tên]</w:t>
             </w:r>
           </w:p>
         </w:tc>
@@ -2738,7 +2833,7 @@
           </w:tcPr>
           <w:p>
             <w:r>
-              <w:t>[Năm sinh hàng thừa kế 8]</w:t>
+              <w:t>[Hàng thừa kế 8 - Năm sinh]</w:t>
             </w:r>
           </w:p>
         </w:tc>
@@ -2748,7 +2843,7 @@
           </w:tcPr>
           <w:p>
             <w:r>
-              <w:t>[Địa chỉ hàng thừa kế 8]</w:t>
+              <w:t>[Hàng thừa kế 8 - Địa chỉ]</w:t>
             </w:r>
           </w:p>
         </w:tc>
@@ -2758,7 +2853,7 @@
           </w:tcPr>
           <w:p>
             <w:r>
-              <w:t>[Ghi chú hàng thừa kế 8]</w:t>
+              <w:t>[Hàng thừa kế 8 - Ghi chú]</w:t>
             </w:r>
           </w:p>
         </w:tc>
@@ -2780,7 +2875,7 @@
           </w:tcPr>
           <w:p>
             <w:r>
-              <w:t>[Họ tên hàng thừa kế 9]</w:t>
+              <w:t>[Hàng thừa kế 9 - Họ tên]</w:t>
             </w:r>
           </w:p>
         </w:tc>
@@ -2790,7 +2885,7 @@
           </w:tcPr>
           <w:p>
             <w:r>
-              <w:t>[Năm sinh hàng thừa kế 9]</w:t>
+              <w:t>[Hàng thừa kế 9 - Năm sinh]</w:t>
             </w:r>
           </w:p>
         </w:tc>
@@ -2800,7 +2895,7 @@
           </w:tcPr>
           <w:p>
             <w:r>
-              <w:t>[Địa chỉ hàng thừa kế 9]</w:t>
+              <w:t>[Hàng thừa kế 9 - Địa chỉ]</w:t>
             </w:r>
           </w:p>
         </w:tc>
@@ -2810,7 +2905,7 @@
           </w:tcPr>
           <w:p>
             <w:r>
-              <w:t>[Ghi chú hàng thừa kế 9]</w:t>
+              <w:t>[Hàng thừa kế 9 - Ghi chú]</w:t>
             </w:r>
           </w:p>
         </w:tc>
@@ -2832,7 +2927,7 @@
           </w:tcPr>
           <w:p>
             <w:r>
-              <w:t>[Họ tên hàng thừa kế 10]</w:t>
+              <w:t>[Hàng thừa kế 10 - Họ tên]</w:t>
             </w:r>
           </w:p>
         </w:tc>
@@ -2842,7 +2937,7 @@
           </w:tcPr>
           <w:p>
             <w:r>
-              <w:t>[Năm sinh hàng thừa kế 10]</w:t>
+              <w:t>[Hàng thừa kế 10 - Năm sinh]</w:t>
             </w:r>
           </w:p>
         </w:tc>
@@ -2852,7 +2947,7 @@
           </w:tcPr>
           <w:p>
             <w:r>
-              <w:t>[Địa chỉ hàng thừa kế 10]</w:t>
+              <w:t>[Hàng thừa kế 10 - Địa chỉ]</w:t>
             </w:r>
           </w:p>
         </w:tc>
@@ -2862,7 +2957,7 @@
           </w:tcPr>
           <w:p>
             <w:r>
-              <w:t>[Ghi chú hàng thừa kế 10]</w:t>
+              <w:t>[Hàng thừa kế 10 - Ghi chú]</w:t>
             </w:r>
           </w:p>
         </w:tc>
@@ -2884,7 +2979,7 @@
           </w:tcPr>
           <w:p>
             <w:r>
-              <w:t>[Họ tên hàng thừa kế 11]</w:t>
+              <w:t>[Hàng thừa kế 11 - Họ tên]</w:t>
             </w:r>
           </w:p>
         </w:tc>
@@ -2894,7 +2989,7 @@
           </w:tcPr>
           <w:p>
             <w:r>
-              <w:t>[Năm sinh hàng thừa kế 11]</w:t>
+              <w:t>[Hàng thừa kế 11 - Năm sinh]</w:t>
             </w:r>
           </w:p>
         </w:tc>
@@ -2904,7 +2999,7 @@
           </w:tcPr>
           <w:p>
             <w:r>
-              <w:t>[Địa chỉ hàng thừa kế 11]</w:t>
+              <w:t>[Hàng thừa kế 11 - Địa chỉ]</w:t>
             </w:r>
           </w:p>
         </w:tc>
@@ -2914,7 +3009,7 @@
           </w:tcPr>
           <w:p>
             <w:r>
-              <w:t>[Ghi chú hàng thừa kế 11]</w:t>
+              <w:t>[Hàng thừa kế 11 - Ghi chú]</w:t>
             </w:r>
           </w:p>
         </w:tc>
@@ -2936,7 +3031,7 @@
           </w:tcPr>
           <w:p>
             <w:r>
-              <w:t>[Họ tên hàng thừa kế 12]</w:t>
+              <w:t>[Hàng thừa kế 12 - Họ tên]</w:t>
             </w:r>
           </w:p>
         </w:tc>
@@ -2946,7 +3041,7 @@
           </w:tcPr>
           <w:p>
             <w:r>
-              <w:t>[Năm sinh hàng thừa kế 12]</w:t>
+              <w:t>[Hàng thừa kế 12 - Năm sinh]</w:t>
             </w:r>
           </w:p>
         </w:tc>
@@ -2956,7 +3051,7 @@
           </w:tcPr>
           <w:p>
             <w:r>
-              <w:t>[Địa chỉ hàng thừa kế 12]</w:t>
+              <w:t>[Hàng thừa kế 12 - Địa chỉ]</w:t>
             </w:r>
           </w:p>
         </w:tc>
@@ -2966,7 +3061,7 @@
           </w:tcPr>
           <w:p>
             <w:r>
-              <w:t>[Ghi chú hàng thừa kế 12]</w:t>
+              <w:t>[Hàng thừa kế 12 - Ghi chú]</w:t>
             </w:r>
           </w:p>
         </w:tc>
@@ -2988,7 +3083,7 @@
           </w:tcPr>
           <w:p>
             <w:r>
-              <w:t>[Họ tên hàng thừa kế 13]</w:t>
+              <w:t>[Hàng thừa kế 13 - Họ tên]</w:t>
             </w:r>
           </w:p>
         </w:tc>
@@ -2998,7 +3093,7 @@
           </w:tcPr>
           <w:p>
             <w:r>
-              <w:t>[Năm sinh hàng thừa kế 13]</w:t>
+              <w:t>[Hàng thừa kế 13 - Năm sinh]</w:t>
             </w:r>
           </w:p>
         </w:tc>
@@ -3008,7 +3103,7 @@
           </w:tcPr>
           <w:p>
             <w:r>
-              <w:t>[Địa chỉ hàng thừa kế 13]</w:t>
+              <w:t>[Hàng thừa kế 13 - Địa chỉ]</w:t>
             </w:r>
           </w:p>
         </w:tc>
@@ -3018,7 +3113,7 @@
           </w:tcPr>
           <w:p>
             <w:r>
-              <w:t>[Ghi chú hàng thừa kế 13]</w:t>
+              <w:t>[Hàng thừa kế 13 - Ghi chú]</w:t>
             </w:r>
           </w:p>
         </w:tc>
@@ -3040,7 +3135,7 @@
           </w:tcPr>
           <w:p>
             <w:r>
-              <w:t>[Họ tên hàng thừa kế 14]</w:t>
+              <w:t>[Hàng thừa kế 14 - Họ tên]</w:t>
             </w:r>
           </w:p>
         </w:tc>
@@ -3050,7 +3145,7 @@
           </w:tcPr>
           <w:p>
             <w:r>
-              <w:t>[Năm sinh hàng thừa kế 14]</w:t>
+              <w:t>[Hàng thừa kế 14 - Năm sinh]</w:t>
             </w:r>
           </w:p>
         </w:tc>
@@ -3060,7 +3155,7 @@
           </w:tcPr>
           <w:p>
             <w:r>
-              <w:t>[Địa chỉ hàng thừa kế 14]</w:t>
+              <w:t>[Hàng thừa kế 14 - Địa chỉ]</w:t>
             </w:r>
           </w:p>
         </w:tc>
@@ -3070,7 +3165,7 @@
           </w:tcPr>
           <w:p>
             <w:r>
-              <w:t>[Ghi chú hàng thừa kế 14]</w:t>
+              <w:t>[Hàng thừa kế 14 - Ghi chú]</w:t>
             </w:r>
           </w:p>
         </w:tc>
@@ -3092,7 +3187,7 @@
           </w:tcPr>
           <w:p>
             <w:r>
-              <w:t>[Họ tên hàng thừa kế 15]</w:t>
+              <w:t>[Hàng thừa kế 15 - Họ tên]</w:t>
             </w:r>
           </w:p>
         </w:tc>
@@ -3102,7 +3197,7 @@
           </w:tcPr>
           <w:p>
             <w:r>
-              <w:t>[Năm sinh hàng thừa kế 15]</w:t>
+              <w:t>[Hàng thừa kế 15 - Năm sinh]</w:t>
             </w:r>
           </w:p>
         </w:tc>
@@ -3112,7 +3207,7 @@
           </w:tcPr>
           <w:p>
             <w:r>
-              <w:t>[Địa chỉ hàng thừa kế 15]</w:t>
+              <w:t>[Hàng thừa kế 15 - Địa chỉ]</w:t>
             </w:r>
           </w:p>
         </w:tc>
@@ -3122,7 +3217,7 @@
           </w:tcPr>
           <w:p>
             <w:r>
-              <w:t>[Ghi chú hàng thừa kế 15]</w:t>
+              <w:t>[Hàng thừa kế 15 - Ghi chú]</w:t>
             </w:r>
           </w:p>
         </w:tc>
@@ -3144,7 +3239,7 @@
           </w:tcPr>
           <w:p>
             <w:r>
-              <w:t>[Họ tên hàng thừa kế 16]</w:t>
+              <w:t>[Hàng thừa kế 16 - Họ tên]</w:t>
             </w:r>
           </w:p>
         </w:tc>
@@ -3154,7 +3249,7 @@
           </w:tcPr>
           <w:p>
             <w:r>
-              <w:t>[Năm sinh hàng thừa kế 16]</w:t>
+              <w:t>[Hàng thừa kế 16 - Năm sinh]</w:t>
             </w:r>
           </w:p>
         </w:tc>
@@ -3164,7 +3259,7 @@
           </w:tcPr>
           <w:p>
             <w:r>
-              <w:t>[Địa chỉ hàng thừa kế 16]</w:t>
+              <w:t>[Hàng thừa kế 16 - Địa chỉ]</w:t>
             </w:r>
           </w:p>
         </w:tc>
@@ -3174,7 +3269,7 @@
           </w:tcPr>
           <w:p>
             <w:r>
-              <w:t>[Ghi chú hàng thừa kế 16]</w:t>
+              <w:t>[Hàng thừa kế 16 - Ghi chú]</w:t>
             </w:r>
           </w:p>
         </w:tc>
@@ -3196,7 +3291,7 @@
           </w:tcPr>
           <w:p>
             <w:r>
-              <w:t>[Họ tên hàng thừa kế 17]</w:t>
+              <w:t>[Hàng thừa kế 17 - Họ tên]</w:t>
             </w:r>
           </w:p>
         </w:tc>
@@ -3206,7 +3301,7 @@
           </w:tcPr>
           <w:p>
             <w:r>
-              <w:t>[Năm sinh hàng thừa kế 17]</w:t>
+              <w:t>[Hàng thừa kế 17 - Năm sinh]</w:t>
             </w:r>
           </w:p>
         </w:tc>
@@ -3216,7 +3311,7 @@
           </w:tcPr>
           <w:p>
             <w:r>
-              <w:t>[Địa chỉ hàng thừa kế 17]</w:t>
+              <w:t>[Hàng thừa kế 17 - Địa chỉ]</w:t>
             </w:r>
           </w:p>
         </w:tc>
@@ -3226,7 +3321,7 @@
           </w:tcPr>
           <w:p>
             <w:r>
-              <w:t>[Ghi chú hàng thừa kế 17]</w:t>
+              <w:t>[Hàng thừa kế 17 - Ghi chú]</w:t>
             </w:r>
           </w:p>
         </w:tc>
@@ -3248,7 +3343,7 @@
           </w:tcPr>
           <w:p>
             <w:r>
-              <w:t>[Họ tên hàng thừa kế 18]</w:t>
+              <w:t>[Hàng thừa kế 18 - Họ tên]</w:t>
             </w:r>
           </w:p>
         </w:tc>
@@ -3258,7 +3353,7 @@
           </w:tcPr>
           <w:p>
             <w:r>
-              <w:t>[Năm sinh hàng thừa kế 18]</w:t>
+              <w:t>[Hàng thừa kế 18 - Năm sinh]</w:t>
             </w:r>
           </w:p>
         </w:tc>
@@ -3268,7 +3363,7 @@
           </w:tcPr>
           <w:p>
             <w:r>
-              <w:t>[Địa chỉ hàng thừa kế 18]</w:t>
+              <w:t>[Hàng thừa kế 18 - Địa chỉ]</w:t>
             </w:r>
           </w:p>
         </w:tc>
@@ -3278,7 +3373,7 @@
           </w:tcPr>
           <w:p>
             <w:r>
-              <w:t>[Ghi chú hàng thừa kế 18]</w:t>
+              <w:t>[Hàng thừa kế 18 - Ghi chú]</w:t>
             </w:r>
           </w:p>
         </w:tc>
@@ -3300,7 +3395,7 @@
           </w:tcPr>
           <w:p>
             <w:r>
-              <w:t>[Họ tên hàng thừa kế 19]</w:t>
+              <w:t>[Hàng thừa kế 19 - Họ tên]</w:t>
             </w:r>
           </w:p>
         </w:tc>
@@ -3310,7 +3405,7 @@
           </w:tcPr>
           <w:p>
             <w:r>
-              <w:t>[Năm sinh hàng thừa kế 19]</w:t>
+              <w:t>[Hàng thừa kế 19 - Năm sinh]</w:t>
             </w:r>
           </w:p>
         </w:tc>
@@ -3320,7 +3415,7 @@
           </w:tcPr>
           <w:p>
             <w:r>
-              <w:t>[Địa chỉ hàng thừa kế 19]</w:t>
+              <w:t>[Hàng thừa kế 19 - Địa chỉ]</w:t>
             </w:r>
           </w:p>
         </w:tc>
@@ -3330,7 +3425,7 @@
           </w:tcPr>
           <w:p>
             <w:r>
-              <w:t>[Ghi chú hàng thừa kế 19]</w:t>
+              <w:t>[Hàng thừa kế 19 - Ghi chú]</w:t>
             </w:r>
           </w:p>
         </w:tc>
@@ -3352,7 +3447,7 @@
           </w:tcPr>
           <w:p>
             <w:r>
-              <w:t>[Họ tên hàng thừa kế 20]</w:t>
+              <w:t>[Hàng thừa kế 20 - Họ tên]</w:t>
             </w:r>
           </w:p>
         </w:tc>
@@ -3362,7 +3457,7 @@
           </w:tcPr>
           <w:p>
             <w:r>
-              <w:t>[Năm sinh hàng thừa kế 20]</w:t>
+              <w:t>[Hàng thừa kế 20 - Năm sinh]</w:t>
             </w:r>
           </w:p>
         </w:tc>
@@ -3372,7 +3467,7 @@
           </w:tcPr>
           <w:p>
             <w:r>
-              <w:t>[Địa chỉ hàng thừa kế 20]</w:t>
+              <w:t>[Hàng thừa kế 20 - Địa chỉ]</w:t>
             </w:r>
           </w:p>
         </w:tc>
@@ -3382,7 +3477,7 @@
           </w:tcPr>
           <w:p>
             <w:r>
-              <w:t>[Ghi chú hàng thừa kế 20]</w:t>
+              <w:t>[Hàng thừa kế 20 - Ghi chú]</w:t>
             </w:r>
           </w:p>
         </w:tc>

</xml_diff>